<commit_message>
feat(docs): fct e fca
</commit_message>
<xml_diff>
--- a/docs/projeto-casos-de-uso-e-estimativas.docx
+++ b/docs/projeto-casos-de-uso-e-estimativas.docx
@@ -11520,6 +11520,55 @@
         <w:t>Estimamos 34 classes para o projeto.</w:t>
       </w:r>
     </w:p>
+    <w:p/>
+    <w:p>
+      <w:pPr>
+        <w:pStyle w:val="Ttulo1"/>
+        <w:spacing w:before="240" w:after="120"/>
+      </w:pPr>
+      <w:r>
+        <w:t>8</w:t>
+      </w:r>
+      <w:r>
+        <w:t xml:space="preserve">. </w:t>
+      </w:r>
+      <w:r>
+        <w:t>FCT e FCA</w:t>
+      </w:r>
+    </w:p>
+    <w:p>
+      <w:pPr>
+        <w:spacing w:after="120"/>
+      </w:pPr>
+      <w:r>
+        <w:t xml:space="preserve">O </w:t>
+      </w:r>
+      <w:r>
+        <w:t>Fator de Complexidade Técnica</w:t>
+      </w:r>
+      <w:r>
+        <w:t xml:space="preserve"> (FCT) e o  </w:t>
+      </w:r>
+      <w:r>
+        <w:t>Fator de Complexidade Ambiental</w:t>
+      </w:r>
+      <w:r>
+        <w:t xml:space="preserve"> (FCA) estão no arquivo “</w:t>
+      </w:r>
+      <w:r>
+        <w:t>FCTeFCA.xlsx</w:t>
+      </w:r>
+      <w:r>
+        <w:t>”.</w:t>
+      </w:r>
+    </w:p>
+    <w:p>
+      <w:pPr>
+        <w:pStyle w:val="Ttulo1"/>
+        <w:spacing w:before="240" w:after="120"/>
+      </w:pPr>
+    </w:p>
+    <w:p/>
     <w:sectPr>
       <w:pgSz w:w="11906" w:h="16838"/>
       <w:pgMar w:top="1440" w:right="1440" w:bottom="1440" w:left="1440" w:header="708" w:footer="708" w:gutter="0"/>

</xml_diff>